<commit_message>
Fix hardcoded Dashboard/CR values, LR fidelity, and LLM authorship
Convert Dashboard and Corrected Register derived numerics to Excel formulas
with OOXML formula caches; correct LR mismatch count and blank control totals;
set certification-blocker KPI to the 7-asset sign-off list; flag FA-000119
over-depreciation; rewrite closed-location, evidence, custody, and regional
notes narratives for structural diversity.

Co-authored-by: efokou <EtienneFokou-E18560@users.noreply.github.com>
</commit_message>
<xml_diff>
--- a/regional_IT_notes.docx
+++ b/regional_IT_notes.docx
@@ -210,7 +210,7 @@
           </w:tcPr>
           <w:p>
             <w:r>
-              <w:t>During the Denver exit walkthrough, someone mentioned a locked cage on floor 3 might still hold this laptop. No cycle-count tag, transfer, or dock receipt was filed.</w:t>
+              <w:t>During the Denver exit walkthrough, someone mentioned a locked cage on floor 3 might still hold this laptop. Unverified lead for MD-00089.</w:t>
             </w:r>
           </w:p>
         </w:tc>
@@ -222,7 +222,7 @@
           </w:tcPr>
           <w:p>
             <w:r>
-              <w:t>Lead only — unverified</w:t>
+              <w:t>Unverified field note</w:t>
             </w:r>
           </w:p>
         </w:tc>
@@ -287,7 +287,7 @@
           </w:tcPr>
           <w:p>
             <w:r>
-              <w:t>Chicago facilities said spare monitors were stacked in the old MDF after the move. This unit was named verbally; nothing was scanned into the register.</w:t>
+              <w:t>Someone on site pointed at Chicago - Closed for MD-00090. Soft intelligence only.</w:t>
             </w:r>
           </w:p>
         </w:tc>
@@ -299,7 +299,7 @@
           </w:tcPr>
           <w:p>
             <w:r>
-              <w:t>Lead only — unverified</w:t>
+              <w:t>Secondhand — not validated</w:t>
             </w:r>
           </w:p>
         </w:tc>
@@ -364,7 +364,7 @@
           </w:tcPr>
           <w:p>
             <w:r>
-              <w:t>A contractor thought MD-00091 went to temporary overflow near the loading dock. Badge logs were not pulled and no transfer ID exists.</w:t>
+              <w:t>MD-00091: informal note about Denver - Closed during exit support. Nothing in tickets.</w:t>
             </w:r>
           </w:p>
         </w:tc>
@@ -376,7 +376,7 @@
           </w:tcPr>
           <w:p>
             <w:r>
-              <w:t>Lead only — unverified</w:t>
+              <w:t>Tech hearsay only</w:t>
             </w:r>
           </w:p>
         </w:tc>
@@ -441,7 +441,7 @@
           </w:tcPr>
           <w:p>
             <w:r>
-              <w:t>Floor lead recalled boxing network gear with Chicago surplus. Serial was not photographed; claim is unverified.</w:t>
+              <w:t>Floor lead recalled boxing network gear with Chicago surplus. Serial was not photographed; claim is unverified. Unverified lead for MD-00092.</w:t>
             </w:r>
           </w:p>
         </w:tc>
@@ -453,7 +453,7 @@
           </w:tcPr>
           <w:p>
             <w:r>
-              <w:t>Lead only — unverified</w:t>
+              <w:t>Lead from walkthrough</w:t>
             </w:r>
           </w:p>
         </w:tc>
@@ -518,7 +518,7 @@
           </w:tcPr>
           <w:p>
             <w:r>
-              <w:t>Night-shift note: device may have stayed in a manager's office that was later sealed. No inventory ticket attached.</w:t>
+              <w:t>Field aside on MD-00093 referenced Denver - Closed. No receiving or transfer row backs it.</w:t>
             </w:r>
           </w:p>
         </w:tc>
@@ -530,7 +530,7 @@
           </w:tcPr>
           <w:p>
             <w:r>
-              <w:t>Lead only — unverified</w:t>
+              <w:t>Unconfirmed verbal claim</w:t>
             </w:r>
           </w:p>
         </w:tc>
@@ -595,7 +595,7 @@
           </w:tcPr>
           <w:p>
             <w:r>
-              <w:t>IT float pool chat referenced this asset as 'still at closed site.' Chat is not an approval or receiving record.</w:t>
+              <w:t>During closeout, MD-00094 was named in passing with Chicago - Closed as the guessed spot. Unconfirmed.</w:t>
             </w:r>
           </w:p>
         </w:tc>
@@ -607,7 +607,7 @@
           </w:tcPr>
           <w:p>
             <w:r>
-              <w:t>Lead only — unverified</w:t>
+              <w:t>Regional chatter — unchecked</w:t>
             </w:r>
           </w:p>
         </w:tc>
@@ -672,7 +672,7 @@
           </w:tcPr>
           <w:p>
             <w:r>
-              <w:t>Vendor teardown crew said they saw a similar model on a pallet marked scrap hold. Asset tag was not confirmed on camera.</w:t>
+              <w:t>Vendor teardown crew said they saw a similar model on a pallet marked scrap hold. Asset tag was not confirmed on camera. Unverified lead for MD-00095.</w:t>
             </w:r>
           </w:p>
         </w:tc>
@@ -684,7 +684,7 @@
           </w:tcPr>
           <w:p>
             <w:r>
-              <w:t>Lead only — unverified</w:t>
+              <w:t>Not corroborated</w:t>
             </w:r>
           </w:p>
         </w:tc>
@@ -749,7 +749,7 @@
           </w:tcPr>
           <w:p>
             <w:r>
-              <w:t>Helpdesk comment claims the user dropped it with building security before last day. Security has no intake log for the tag.</w:t>
+              <w:t>Note against MD-00096: alleged presence at Chicago - Closed. Needs an independent find.</w:t>
             </w:r>
           </w:p>
         </w:tc>
@@ -761,7 +761,7 @@
           </w:tcPr>
           <w:p>
             <w:r>
-              <w:t>Lead only — unverified</w:t>
+              <w:t>Informal tip only</w:t>
             </w:r>
           </w:p>
         </w:tc>
@@ -826,7 +826,7 @@
           </w:tcPr>
           <w:p>
             <w:r>
-              <w:t>Regional spare inventory spreadsheet (offline) listed a placeholder row for this tag with location TBD. Spreadsheet is not a system of record.</w:t>
+              <w:t>Site support named MD-00097 while discussing Denver - Closed. Not validated.</w:t>
             </w:r>
           </w:p>
         </w:tc>
@@ -838,7 +838,7 @@
           </w:tcPr>
           <w:p>
             <w:r>
-              <w:t>Lead only — unverified</w:t>
+              <w:t>Unverified contractor remark</w:t>
             </w:r>
           </w:p>
         </w:tc>
@@ -903,7 +903,7 @@
           </w:tcPr>
           <w:p>
             <w:r>
-              <w:t>Move captain's email guessed the device rode with furniture to storage. Furniture BOL does not list IT assets.</w:t>
+              <w:t>Move captain's email guessed the device rode with furniture to storage. Furniture BOL does not list IT assets. Unverified lead for MD-00098.</w:t>
             </w:r>
           </w:p>
         </w:tc>
@@ -915,7 +915,7 @@
           </w:tcPr>
           <w:p>
             <w:r>
-              <w:t>Lead only — unverified</w:t>
+              <w:t>Floor rumor — no ticket</w:t>
             </w:r>
           </w:p>
         </w:tc>
@@ -980,7 +980,7 @@
           </w:tcPr>
           <w:p>
             <w:r>
-              <w:t>An intern's handwritten punch list includes this tag under 'find later.' No follow-up work order was opened.</w:t>
+              <w:t>Denver - Closed came up as a guess for MD-00099 in hallway conversation. No artifact.</w:t>
             </w:r>
           </w:p>
         </w:tc>
@@ -992,7 +992,7 @@
           </w:tcPr>
           <w:p>
             <w:r>
-              <w:t>Lead only — unverified</w:t>
+              <w:t>Lead only; no artifact</w:t>
             </w:r>
           </w:p>
         </w:tc>
@@ -1057,7 +1057,7 @@
           </w:tcPr>
           <w:p>
             <w:r>
-              <w:t>Closing checklist has a sticky note 'missing — check cage.' Sticky note is not receiving evidence.</w:t>
+              <w:t>Exit-team aside linked MD-00100 to Chicago - Closed. Keep as lead only.</w:t>
             </w:r>
           </w:p>
         </w:tc>
@@ -1069,7 +1069,7 @@
           </w:tcPr>
           <w:p>
             <w:r>
-              <w:t>Lead only — unverified</w:t>
+              <w:t>Unchecked site comment</w:t>
             </w:r>
           </w:p>
         </w:tc>
@@ -1134,7 +1134,7 @@
           </w:tcPr>
           <w:p>
             <w:r>
-              <w:t>Recycler pickup was reportedly included with the July pallet, but the certificate bundle did not list this asset tag.</w:t>
+              <w:t>Recycler pickup was reportedly included with the July pallet, but the certificate bundle did not list this asset tag. Unverified lead for MD-00114.</w:t>
             </w:r>
           </w:p>
         </w:tc>
@@ -1146,7 +1146,7 @@
           </w:tcPr>
           <w:p>
             <w:r>
-              <w:t>Lead only — unverified</w:t>
+              <w:t>Anecdote pending proof</w:t>
             </w:r>
           </w:p>
         </w:tc>
@@ -1211,7 +1211,7 @@
           </w:tcPr>
           <w:p>
             <w:r>
-              <w:t>Technician believes the device was wiped and recycled. No certificate or approval was located.</w:t>
+              <w:t>Informal recovery tip for MD-00118 points at Dallas. Still unverified.</w:t>
             </w:r>
           </w:p>
         </w:tc>
@@ -1223,7 +1223,7 @@
           </w:tcPr>
           <w:p>
             <w:r>
-              <w:t>Lead only — unverified</w:t>
+              <w:t>Unvalidated tech note</w:t>
             </w:r>
           </w:p>
         </w:tc>
@@ -1288,7 +1288,7 @@
           </w:tcPr>
           <w:p>
             <w:r>
-              <w:t>Asset appears to have been moved to Regional IT stock. The transfer record contains no approval ID.</w:t>
+              <w:t>Floor conversation flagged MD-00058; claimed area Chicago - Closed. Not evidence.</w:t>
             </w:r>
           </w:p>
         </w:tc>
@@ -1300,7 +1300,7 @@
           </w:tcPr>
           <w:p>
             <w:r>
-              <w:t>Lead only — unverified</w:t>
+              <w:t>Soft lead — ignore for clearance</w:t>
             </w:r>
           </w:p>
         </w:tc>
@@ -1365,7 +1365,7 @@
           </w:tcPr>
           <w:p>
             <w:r>
-              <w:t>Return package was delivered according to the technician, but the shipment serial does not match the asset register and the dock exception photo is only a lead.</w:t>
+              <w:t>Return package was delivered according to the technician, but the shipment serial does not match the asset register and the dock exception photo is only a lead. Unverified lead for MD-00082.</w:t>
             </w:r>
           </w:p>
         </w:tc>
@@ -1377,7 +1377,7 @@
           </w:tcPr>
           <w:p>
             <w:r>
-              <w:t>Lead only — unverified</w:t>
+              <w:t>Non-authoritative remark</w:t>
             </w:r>
           </w:p>
         </w:tc>
@@ -1419,7 +1419,7 @@
           </w:tcPr>
           <w:p>
             <w:r>
-              <w:t>Finance coordinator said this network appliance was expensed under the capitalization threshold so no FA row is needed. Treat as closed for ledger purposes.</w:t>
+              <w:t>Soft lead only: MD-00132 possibly at Atlanta Warehouse.</w:t>
             </w:r>
           </w:p>
         </w:tc>
@@ -1429,7 +1429,7 @@
           </w:tcPr>
           <w:p>
             <w:r>
-              <w:t>Lead only — unverified</w:t>
+              <w:t>Unverified ops aside</w:t>
             </w:r>
           </w:p>
         </w:tc>

</xml_diff>